<commit_message>
completed and formatted.. now time to check
</commit_message>
<xml_diff>
--- a/Assignment 3/Assignment 3.docx
+++ b/Assignment 3/Assignment 3.docx
@@ -3,6 +3,9 @@
 <w:document xmlns:wpc="http://schemas.microsoft.com/office/word/2010/wordprocessingCanvas" xmlns:cx="http://schemas.microsoft.com/office/drawing/2014/chartex" xmlns:cx1="http://schemas.microsoft.com/office/drawing/2015/9/8/chartex" xmlns:cx2="http://schemas.microsoft.com/office/drawing/2015/10/21/chartex" xmlns:cx3="http://schemas.microsoft.com/office/drawing/2016/5/9/chartex" xmlns:cx4="http://schemas.microsoft.com/office/drawing/2016/5/10/chartex" xmlns:cx5="http://schemas.microsoft.com/office/drawing/2016/5/11/chartex" xmlns:cx6="http://schemas.microsoft.com/office/drawing/2016/5/12/chartex" xmlns:cx7="http://schemas.microsoft.com/office/drawing/2016/5/13/chartex" xmlns:cx8="http://schemas.microsoft.com/office/drawing/2016/5/14/chartex" xmlns:mc="http://schemas.openxmlformats.org/markup-compatibility/2006" xmlns:aink="http://schemas.microsoft.com/office/drawing/2016/ink" xmlns:am3d="http://schemas.microsoft.com/office/drawing/2017/model3d" xmlns:o="urn:schemas-microsoft-com:office:office" xmlns:oel="http://schemas.microsoft.com/office/2019/extlst" xmlns:r="http://schemas.openxmlformats.org/officeDocument/2006/relationships" xmlns:m="http://schemas.openxmlformats.org/officeDocument/2006/math" xmlns:v="urn:schemas-microsoft-com:vml" xmlns:wp14="http://schemas.microsoft.com/office/word/2010/wordprocessingDrawing" xmlns:wp="http://schemas.openxmlformats.org/drawingml/2006/wordprocessingDrawing" xmlns:w10="urn:schemas-microsoft-com:office:word" xmlns:w="http://schemas.openxmlformats.org/wordprocessingml/2006/main" xmlns:w14="http://schemas.microsoft.com/office/word/2010/wordml" xmlns:w15="http://schemas.microsoft.com/office/word/2012/wordml" xmlns:w16cex="http://schemas.microsoft.com/office/word/2018/wordml/cex" xmlns:w16cid="http://schemas.microsoft.com/office/word/2016/wordml/cid" xmlns:w16="http://schemas.microsoft.com/office/word/2018/wordml" xmlns:w16du="http://schemas.microsoft.com/office/word/2023/wordml/word16du" xmlns:w16sdtdh="http://schemas.microsoft.com/office/word/2020/wordml/sdtdatahash" xmlns:w16sdtfl="http://schemas.microsoft.com/office/word/2024/wordml/sdtformatlock" xmlns:w16se="http://schemas.microsoft.com/office/word/2015/wordml/symex" xmlns:wpg="http://schemas.microsoft.com/office/word/2010/wordprocessingGroup" xmlns:wpi="http://schemas.microsoft.com/office/word/2010/wordprocessingInk" xmlns:wne="http://schemas.microsoft.com/office/word/2006/wordml" xmlns:wps="http://schemas.microsoft.com/office/word/2010/wordprocessingShape" mc:Ignorable="w14 w15 w16se w16cid w16 w16cex w16sdtdh w16sdtfl w16du wp14">
   <w:body>
     <w:p>
+      <w:pPr>
+        <w:pStyle w:val="Title"/>
+      </w:pPr>
       <w:r>
         <w:t>Computer Science 378: Introduction to Database Management Assignment 3</w:t>
       </w:r>
@@ -41,8 +44,22 @@
     </w:p>
     <w:p/>
     <w:p>
-      <w:r>
-        <w:t>1. (12 marks) Answer the following questions (250 words max/question).</w:t>
+      <w:pPr>
+        <w:pStyle w:val="Heading2"/>
+      </w:pPr>
+      <w:r>
+        <w:t>1.</w:t>
+      </w:r>
+      <w:r>
+        <w:t>Question 1</w:t>
+      </w:r>
+    </w:p>
+    <w:p>
+      <w:pPr>
+        <w:pStyle w:val="Subtitle"/>
+      </w:pPr>
+      <w:r>
+        <w:t>(12 marks) Answer the following questions (250 words max/question).</w:t>
       </w:r>
     </w:p>
     <w:p>
@@ -197,6 +214,7 @@
         </w:numPr>
       </w:pPr>
       <w:r>
+        <w:lastRenderedPageBreak/>
         <w:t>A budgeting software</w:t>
       </w:r>
       <w:r>
@@ -209,11 +227,7 @@
         <w:t xml:space="preserve">cannot be null, and a transaction amount column that is numeric data type.  If the system attempts to insert a record with no date, or a value of “five hundred” instead of 500, </w:t>
       </w:r>
       <w:r>
-        <w:t xml:space="preserve">the database will reject the record.  The data is required non-null field, meaning a null transaction date would not be allowed. It doesn’t make sense </w:t>
-      </w:r>
-      <w:r>
-        <w:lastRenderedPageBreak/>
-        <w:t xml:space="preserve">to record a transaction without a date.  </w:t>
+        <w:t xml:space="preserve">the database will reject the record.  The data is required non-null field, meaning a null transaction date would not be allowed. It doesn’t make sense to record a transaction without a date.  </w:t>
       </w:r>
       <w:r>
         <w:t>Furthermore,</w:t>
@@ -288,7 +302,15 @@
         <w:t xml:space="preserve">arrangements. This </w:t>
       </w:r>
       <w:r>
-        <w:t>can improve performance of data sets, and make them more manageable.</w:t>
+        <w:t xml:space="preserve">can improve performance of data </w:t>
+      </w:r>
+      <w:proofErr w:type="gramStart"/>
+      <w:r>
+        <w:t>sets, and</w:t>
+      </w:r>
+      <w:proofErr w:type="gramEnd"/>
+      <w:r>
+        <w:t xml:space="preserve"> make them more manageable.</w:t>
       </w:r>
     </w:p>
     <w:p>
@@ -350,7 +372,15 @@
         <w:t xml:space="preserve">, where data columns that describe the same entity are split across multiple tables.  One advantage of this is if </w:t>
       </w:r>
       <w:r>
-        <w:t>certain records of an entity are infrequently queried, or changed, than they can be left out of the more frequently accessed or altered data.</w:t>
+        <w:t xml:space="preserve">certain records of an entity are infrequently queried, or changed, </w:t>
+      </w:r>
+      <w:proofErr w:type="gramStart"/>
+      <w:r>
+        <w:t>than</w:t>
+      </w:r>
+      <w:proofErr w:type="gramEnd"/>
+      <w:r>
+        <w:t xml:space="preserve"> they can be left out of the more frequently accessed or altered data.</w:t>
       </w:r>
     </w:p>
     <w:p>
@@ -377,48 +407,77 @@
           <w:b/>
           <w:bCs/>
         </w:rPr>
-        <w:t xml:space="preserve"> partitioning</w:t>
-      </w:r>
+        <w:t xml:space="preserve"> </w:t>
+      </w:r>
+      <w:proofErr w:type="gramStart"/>
       <w:r>
         <w:rPr>
           <w:b/>
           <w:bCs/>
         </w:rPr>
-        <w:t xml:space="preserve"> </w:t>
-      </w:r>
-      <w:r>
-        <w:t xml:space="preserve"> is the splitting of data by rows</w:t>
-      </w:r>
-      <w:r>
-        <w:t xml:space="preserve"> into multiple tables.  This is most effective when tables contain extreme large data sets. </w:t>
-      </w:r>
-      <w:proofErr w:type="spellStart"/>
-      <w:r>
-        <w:t>Partitioninig</w:t>
-      </w:r>
-      <w:proofErr w:type="spellEnd"/>
-      <w:r>
-        <w:t xml:space="preserve"> can be done by date, identity or identifier, or ranges</w:t>
-      </w:r>
-      <w:r>
-        <w:t xml:space="preserve"> or more. Splitting a very large data set into smaller data sets can improve performance of both querying and modifying data.</w:t>
-      </w:r>
-    </w:p>
-    <w:p>
-      <w:pPr>
+        <w:t>partitioning</w:t>
+      </w:r>
+      <w:r>
         <w:rPr>
           <w:b/>
           <w:bCs/>
         </w:rPr>
-      </w:pPr>
-      <w:r>
         <w:t xml:space="preserve"> </w:t>
       </w:r>
+      <w:r>
+        <w:t xml:space="preserve"> is</w:t>
+      </w:r>
+      <w:proofErr w:type="gramEnd"/>
+      <w:r>
+        <w:t xml:space="preserve"> the splitting of data by rows</w:t>
+      </w:r>
+      <w:r>
+        <w:t xml:space="preserve"> into multiple tables.  This is most effective when tables contain extreme large data sets. </w:t>
+      </w:r>
+      <w:proofErr w:type="spellStart"/>
+      <w:r>
+        <w:t>Partitioninig</w:t>
+      </w:r>
+      <w:proofErr w:type="spellEnd"/>
+      <w:r>
+        <w:t xml:space="preserve"> can be done by date, identity or identifier, or ranges</w:t>
+      </w:r>
+      <w:r>
+        <w:t xml:space="preserve"> or more. Splitting a very large data set into smaller data sets can improve performance of both querying and modifying data.</w:t>
+      </w:r>
+    </w:p>
+    <w:p>
+      <w:pPr>
+        <w:rPr>
+          <w:b/>
+          <w:bCs/>
+        </w:rPr>
+      </w:pPr>
+      <w:r>
+        <w:t xml:space="preserve"> </w:t>
+      </w:r>
     </w:p>
     <w:p/>
     <w:p>
-      <w:r>
-        <w:t>2. (9 marks) Answer the following questions (250 words max/question).</w:t>
+      <w:pPr>
+        <w:pStyle w:val="Heading2"/>
+      </w:pPr>
+      <w:r>
+        <w:t xml:space="preserve">2. </w:t>
+      </w:r>
+      <w:r>
+        <w:t>Question 2</w:t>
+      </w:r>
+    </w:p>
+    <w:p>
+      <w:pPr>
+        <w:pStyle w:val="Subtitle"/>
+      </w:pPr>
+      <w:r>
+        <w:rPr>
+          <w:rStyle w:val="SubtitleChar"/>
+        </w:rPr>
+        <w:t>(9 marks) Answer the following questions (250 words max/question).</w:t>
       </w:r>
     </w:p>
     <w:p>
@@ -580,6 +639,7 @@
         </w:numPr>
       </w:pPr>
       <w:r>
+        <w:lastRenderedPageBreak/>
         <w:t>Compare hashed file organization versus indexed file organization. List two advantages of</w:t>
       </w:r>
       <w:r>
@@ -631,74 +691,98 @@
         <w:t xml:space="preserve"> these are called secondary indexes.</w:t>
       </w:r>
       <w:r>
+        <w:t xml:space="preserve"> Indexes do require some additional space for indexing tables, however, do not require the large empty blocks that </w:t>
+      </w:r>
+      <w:proofErr w:type="spellStart"/>
+      <w:r>
+        <w:t>hasing</w:t>
+      </w:r>
+      <w:proofErr w:type="spellEnd"/>
+      <w:r>
+        <w:t xml:space="preserve"> does.  </w:t>
+      </w:r>
+      <w:r>
+        <w:t>Indexes support easy retrieval of multiple indexes, and updating of records is easy and fast.</w:t>
+      </w:r>
+      <w:r>
+        <w:br/>
+      </w:r>
+      <w:r>
+        <w:t xml:space="preserve">Hash </w:t>
+      </w:r>
+      <w:r>
+        <w:t xml:space="preserve">file organization is </w:t>
+      </w:r>
+      <w:r>
+        <w:t xml:space="preserve">the process of </w:t>
+      </w:r>
+      <w:proofErr w:type="spellStart"/>
+      <w:r>
+        <w:t>organizgin</w:t>
+      </w:r>
+      <w:r>
+        <w:t>g</w:t>
+      </w:r>
+      <w:proofErr w:type="spellEnd"/>
+      <w:r>
+        <w:t xml:space="preserve"> file addressing based on </w:t>
+      </w:r>
+      <w:proofErr w:type="gramStart"/>
+      <w:r>
+        <w:t>an</w:t>
+      </w:r>
+      <w:proofErr w:type="gramEnd"/>
+      <w:r>
+        <w:t xml:space="preserve"> hashing algorithm.</w:t>
+      </w:r>
+      <w:r>
         <w:t xml:space="preserve"> </w:t>
       </w:r>
       <w:r>
-        <w:lastRenderedPageBreak/>
-        <w:t xml:space="preserve">Indexes do require some additional space for indexing tables, however, do not require the large empty blocks that </w:t>
-      </w:r>
-      <w:proofErr w:type="spellStart"/>
-      <w:r>
-        <w:t>hasing</w:t>
-      </w:r>
-      <w:proofErr w:type="spellEnd"/>
-      <w:r>
-        <w:t xml:space="preserve"> does.  </w:t>
-      </w:r>
-      <w:r>
-        <w:t>Indexes support easy retrieval of multiple indexes, and updating of records is easy and fast.</w:t>
-      </w:r>
-      <w:r>
-        <w:br/>
-      </w:r>
-      <w:r>
-        <w:t xml:space="preserve">Hash </w:t>
-      </w:r>
-      <w:r>
-        <w:t xml:space="preserve">file organization is </w:t>
-      </w:r>
-      <w:r>
-        <w:t xml:space="preserve">the process of </w:t>
-      </w:r>
-      <w:proofErr w:type="spellStart"/>
-      <w:r>
-        <w:t>organizgin</w:t>
-      </w:r>
-      <w:r>
-        <w:t>g</w:t>
-      </w:r>
-      <w:proofErr w:type="spellEnd"/>
-      <w:r>
-        <w:t xml:space="preserve"> file addressing based on an hashing algorithm.</w:t>
+        <w:t xml:space="preserve">Hash organization allows for very </w:t>
+      </w:r>
+      <w:r>
+        <w:t>reading</w:t>
+      </w:r>
+      <w:r>
+        <w:t>, writing and updating</w:t>
+      </w:r>
+      <w:r>
+        <w:t>, they’re also very fast</w:t>
+      </w:r>
+      <w:r>
+        <w:t xml:space="preserve"> at retrievals using equality operations.  Hashing, however, requires more storage space</w:t>
+      </w:r>
+      <w:r>
+        <w:t xml:space="preserve"> and do not support sequential retrieval.</w:t>
       </w:r>
       <w:r>
         <w:t xml:space="preserve"> </w:t>
       </w:r>
-      <w:r>
-        <w:t xml:space="preserve">Hash organization allows for very </w:t>
-      </w:r>
-      <w:r>
-        <w:t>reading</w:t>
-      </w:r>
-      <w:r>
-        <w:t>, writing and updating</w:t>
-      </w:r>
-      <w:r>
-        <w:t>, they’re also very fast</w:t>
-      </w:r>
-      <w:r>
-        <w:t xml:space="preserve"> at retrievals using equality operations.  Hashing, however, requires more storage space</w:t>
-      </w:r>
-      <w:r>
-        <w:t xml:space="preserve"> and do not support sequential retrieval.</w:t>
-      </w:r>
-      <w:r>
-        <w:t xml:space="preserve"> </w:t>
-      </w:r>
-    </w:p>
-    <w:p>
-      <w:r>
-        <w:t>3. (12 marks) Consider the following database project with these tables:</w:t>
+    </w:p>
+    <w:p>
+      <w:pPr>
+        <w:pStyle w:val="Heading2"/>
+      </w:pPr>
+      <w:r>
+        <w:t xml:space="preserve">3. </w:t>
+      </w:r>
+      <w:r>
+        <w:t>Question 3</w:t>
+      </w:r>
+    </w:p>
+    <w:p>
+      <w:pPr>
+        <w:pStyle w:val="Heading2"/>
+        <w:rPr>
+          <w:rStyle w:val="SubtitleChar"/>
+        </w:rPr>
+      </w:pPr>
+      <w:r>
+        <w:rPr>
+          <w:rStyle w:val="SubtitleChar"/>
+        </w:rPr>
+        <w:t>(12 marks) Consider the following database project with these tables:</w:t>
       </w:r>
     </w:p>
     <w:p>
@@ -933,6 +1017,7 @@
         <w:t xml:space="preserve">, </w:t>
       </w:r>
       <w:proofErr w:type="spellStart"/>
+      <w:proofErr w:type="gramStart"/>
       <w:r>
         <w:rPr>
           <w:rFonts w:ascii="Courier New" w:hAnsi="Courier New" w:cs="Courier New"/>
@@ -942,6 +1027,7 @@
         <w:t>proj.location</w:t>
       </w:r>
       <w:proofErr w:type="spellEnd"/>
+      <w:proofErr w:type="gramEnd"/>
       <w:r>
         <w:rPr>
           <w:rFonts w:ascii="Courier New" w:hAnsi="Courier New" w:cs="Courier New"/>
@@ -969,6 +1055,7 @@
         <w:t xml:space="preserve">, </w:t>
       </w:r>
       <w:proofErr w:type="spellStart"/>
+      <w:proofErr w:type="gramStart"/>
       <w:r>
         <w:rPr>
           <w:rFonts w:ascii="Courier New" w:hAnsi="Courier New" w:cs="Courier New"/>
@@ -994,6 +1081,7 @@
         <w:t>.worked</w:t>
       </w:r>
       <w:proofErr w:type="spellEnd"/>
+      <w:proofErr w:type="gramEnd"/>
       <w:r>
         <w:rPr>
           <w:rFonts w:ascii="Courier New" w:hAnsi="Courier New" w:cs="Courier New"/>
@@ -1159,100 +1247,106 @@
         <w:t xml:space="preserve"> on </w:t>
       </w:r>
       <w:proofErr w:type="spellStart"/>
+      <w:proofErr w:type="gramStart"/>
       <w:r>
         <w:rPr>
           <w:rFonts w:ascii="Courier New" w:hAnsi="Courier New" w:cs="Courier New"/>
           <w:sz w:val="20"/>
           <w:szCs w:val="20"/>
         </w:rPr>
-        <w:t>pa.proj_no</w:t>
-      </w:r>
-      <w:proofErr w:type="spellEnd"/>
+        <w:t>pa.proj</w:t>
+      </w:r>
+      <w:proofErr w:type="gramEnd"/>
       <w:r>
         <w:rPr>
           <w:rFonts w:ascii="Courier New" w:hAnsi="Courier New" w:cs="Courier New"/>
           <w:sz w:val="20"/>
           <w:szCs w:val="20"/>
         </w:rPr>
-        <w:t xml:space="preserve"> = </w:t>
-      </w:r>
-      <w:proofErr w:type="spellStart"/>
+        <w:t>_no</w:t>
+      </w:r>
+      <w:proofErr w:type="spellEnd"/>
       <w:r>
         <w:rPr>
           <w:rFonts w:ascii="Courier New" w:hAnsi="Courier New" w:cs="Courier New"/>
           <w:sz w:val="20"/>
           <w:szCs w:val="20"/>
         </w:rPr>
-        <w:t>proj.proj_no</w:t>
-      </w:r>
-      <w:proofErr w:type="spellEnd"/>
-    </w:p>
-    <w:p>
-      <w:pPr>
+        <w:t xml:space="preserve"> = </w:t>
+      </w:r>
+      <w:proofErr w:type="spellStart"/>
+      <w:proofErr w:type="gramStart"/>
+      <w:r>
         <w:rPr>
           <w:rFonts w:ascii="Courier New" w:hAnsi="Courier New" w:cs="Courier New"/>
           <w:sz w:val="20"/>
           <w:szCs w:val="20"/>
         </w:rPr>
-      </w:pPr>
+        <w:t>proj.proj</w:t>
+      </w:r>
+      <w:proofErr w:type="gramEnd"/>
       <w:r>
         <w:rPr>
           <w:rFonts w:ascii="Courier New" w:hAnsi="Courier New" w:cs="Courier New"/>
           <w:sz w:val="20"/>
           <w:szCs w:val="20"/>
         </w:rPr>
-        <w:t xml:space="preserve">where </w:t>
-      </w:r>
-      <w:proofErr w:type="spellStart"/>
-      <w:r>
+        <w:t>_no</w:t>
+      </w:r>
+      <w:proofErr w:type="spellEnd"/>
+    </w:p>
+    <w:p>
+      <w:pPr>
         <w:rPr>
           <w:rFonts w:ascii="Courier New" w:hAnsi="Courier New" w:cs="Courier New"/>
           <w:sz w:val="20"/>
           <w:szCs w:val="20"/>
         </w:rPr>
-        <w:t>emp.salary</w:t>
-      </w:r>
-      <w:proofErr w:type="spellEnd"/>
+      </w:pPr>
       <w:r>
         <w:rPr>
           <w:rFonts w:ascii="Courier New" w:hAnsi="Courier New" w:cs="Courier New"/>
           <w:sz w:val="20"/>
           <w:szCs w:val="20"/>
         </w:rPr>
-        <w:t xml:space="preserve"> &gt; 66000</w:t>
-      </w:r>
-    </w:p>
-    <w:p>
-      <w:pPr>
+        <w:t xml:space="preserve">where </w:t>
+      </w:r>
+      <w:proofErr w:type="spellStart"/>
+      <w:proofErr w:type="gramStart"/>
+      <w:r>
         <w:rPr>
           <w:rFonts w:ascii="Courier New" w:hAnsi="Courier New" w:cs="Courier New"/>
           <w:sz w:val="20"/>
           <w:szCs w:val="20"/>
         </w:rPr>
-      </w:pPr>
+        <w:t>emp.salary</w:t>
+      </w:r>
+      <w:proofErr w:type="spellEnd"/>
+      <w:proofErr w:type="gramEnd"/>
       <w:r>
         <w:rPr>
           <w:rFonts w:ascii="Courier New" w:hAnsi="Courier New" w:cs="Courier New"/>
           <w:sz w:val="20"/>
           <w:szCs w:val="20"/>
         </w:rPr>
-        <w:t xml:space="preserve">order by </w:t>
-      </w:r>
-      <w:r>
+        <w:t xml:space="preserve"> &gt; 66000</w:t>
+      </w:r>
+    </w:p>
+    <w:p>
+      <w:pPr>
         <w:rPr>
           <w:rFonts w:ascii="Courier New" w:hAnsi="Courier New" w:cs="Courier New"/>
           <w:sz w:val="20"/>
           <w:szCs w:val="20"/>
         </w:rPr>
-        <w:t>emp.</w:t>
-      </w:r>
+      </w:pPr>
       <w:r>
         <w:rPr>
           <w:rFonts w:ascii="Courier New" w:hAnsi="Courier New" w:cs="Courier New"/>
           <w:sz w:val="20"/>
           <w:szCs w:val="20"/>
         </w:rPr>
-        <w:t>name desc</w:t>
+        <w:t xml:space="preserve">order by </w:t>
       </w:r>
       <w:r>
         <w:rPr>
@@ -1260,46 +1354,63 @@
           <w:sz w:val="20"/>
           <w:szCs w:val="20"/>
         </w:rPr>
-        <w:t xml:space="preserve"> </w:t>
-      </w:r>
-    </w:p>
-    <w:p>
-      <w:pPr>
-        <w:rPr>
-          <w:rFonts w:ascii="Courier New" w:hAnsi="Courier New" w:cs="Courier New"/>
-        </w:rPr>
-      </w:pPr>
-      <w:r>
-        <w:rPr>
-          <w:rFonts w:ascii="Courier New" w:hAnsi="Courier New" w:cs="Courier New"/>
-        </w:rPr>
-        <w:t xml:space="preserve"> </w:t>
-      </w:r>
-    </w:p>
-    <w:p>
-      <w:r>
-        <w:t>Define indexes on selected attributes to speed up your query. Justify your selections.</w:t>
-      </w:r>
-    </w:p>
-    <w:p>
-      <w:r>
-        <w:t>Write SQL queries to create the indexes you defined above.</w:t>
-      </w:r>
-    </w:p>
-    <w:p>
-      <w:pPr>
+        <w:t>emp.</w:t>
+      </w:r>
+      <w:r>
         <w:rPr>
           <w:rFonts w:ascii="Courier New" w:hAnsi="Courier New" w:cs="Courier New"/>
           <w:sz w:val="20"/>
           <w:szCs w:val="20"/>
         </w:rPr>
-      </w:pPr>
+        <w:t>name desc</w:t>
+      </w:r>
       <w:r>
         <w:rPr>
           <w:rFonts w:ascii="Courier New" w:hAnsi="Courier New" w:cs="Courier New"/>
           <w:sz w:val="20"/>
           <w:szCs w:val="20"/>
         </w:rPr>
+        <w:t xml:space="preserve"> </w:t>
+      </w:r>
+    </w:p>
+    <w:p>
+      <w:pPr>
+        <w:rPr>
+          <w:rFonts w:ascii="Courier New" w:hAnsi="Courier New" w:cs="Courier New"/>
+        </w:rPr>
+      </w:pPr>
+      <w:r>
+        <w:rPr>
+          <w:rFonts w:ascii="Courier New" w:hAnsi="Courier New" w:cs="Courier New"/>
+        </w:rPr>
+        <w:t xml:space="preserve"> </w:t>
+      </w:r>
+    </w:p>
+    <w:p>
+      <w:r>
+        <w:t>Define indexes on selected attributes to speed up your query. Justify your selections.</w:t>
+      </w:r>
+    </w:p>
+    <w:p>
+      <w:r>
+        <w:lastRenderedPageBreak/>
+        <w:t>Write SQL queries to create the indexes you defined above.</w:t>
+      </w:r>
+    </w:p>
+    <w:p>
+      <w:pPr>
+        <w:rPr>
+          <w:rFonts w:ascii="Courier New" w:hAnsi="Courier New" w:cs="Courier New"/>
+          <w:sz w:val="20"/>
+          <w:szCs w:val="20"/>
+        </w:rPr>
+      </w:pPr>
+      <w:r>
+        <w:rPr>
+          <w:rFonts w:ascii="Courier New" w:hAnsi="Courier New" w:cs="Courier New"/>
+          <w:sz w:val="20"/>
+          <w:szCs w:val="20"/>
+        </w:rPr>
         <w:t>SQL:</w:t>
       </w:r>
     </w:p>
@@ -1505,7 +1616,25 @@
           <w:sz w:val="18"/>
           <w:szCs w:val="18"/>
         </w:rPr>
-        <w:t>an optional column that can assi</w:t>
+        <w:t xml:space="preserve">an optional column that </w:t>
+      </w:r>
+      <w:proofErr w:type="gramStart"/>
+      <w:r>
+        <w:rPr>
+          <w:rFonts w:ascii="Courier New" w:hAnsi="Courier New" w:cs="Courier New"/>
+          <w:sz w:val="18"/>
+          <w:szCs w:val="18"/>
+        </w:rPr>
+        <w:t>can</w:t>
+      </w:r>
+      <w:proofErr w:type="gramEnd"/>
+      <w:r>
+        <w:rPr>
+          <w:rFonts w:ascii="Courier New" w:hAnsi="Courier New" w:cs="Courier New"/>
+          <w:sz w:val="18"/>
+          <w:szCs w:val="18"/>
+        </w:rPr>
+        <w:t xml:space="preserve"> assi</w:t>
       </w:r>
       <w:r>
         <w:rPr>
@@ -1571,7 +1700,6 @@
           <w:sz w:val="18"/>
           <w:szCs w:val="18"/>
         </w:rPr>
-        <w:lastRenderedPageBreak/>
         <w:t xml:space="preserve">CREATE INDEX </w:t>
       </w:r>
       <w:proofErr w:type="spellStart"/>
@@ -1601,6 +1729,7 @@
         <w:t xml:space="preserve"> on </w:t>
       </w:r>
       <w:proofErr w:type="spellStart"/>
+      <w:proofErr w:type="gramStart"/>
       <w:r>
         <w:rPr>
           <w:rFonts w:ascii="Courier New" w:hAnsi="Courier New" w:cs="Courier New"/>
@@ -1619,6 +1748,7 @@
         <w:t xml:space="preserve">  (</w:t>
       </w:r>
       <w:proofErr w:type="spellStart"/>
+      <w:proofErr w:type="gramEnd"/>
       <w:r>
         <w:rPr>
           <w:rFonts w:ascii="Courier New" w:hAnsi="Courier New" w:cs="Courier New"/>
@@ -1652,13 +1782,23 @@
         </w:rPr>
         <w:t>--</w:t>
       </w:r>
-      <w:r>
-        <w:rPr>
-          <w:rFonts w:ascii="Courier New" w:hAnsi="Courier New" w:cs="Courier New"/>
-          <w:sz w:val="18"/>
-          <w:szCs w:val="18"/>
-        </w:rPr>
-        <w:t xml:space="preserve">Similar to </w:t>
+      <w:proofErr w:type="gramStart"/>
+      <w:r>
+        <w:rPr>
+          <w:rFonts w:ascii="Courier New" w:hAnsi="Courier New" w:cs="Courier New"/>
+          <w:sz w:val="18"/>
+          <w:szCs w:val="18"/>
+        </w:rPr>
+        <w:t>Similar to</w:t>
+      </w:r>
+      <w:proofErr w:type="gramEnd"/>
+      <w:r>
+        <w:rPr>
+          <w:rFonts w:ascii="Courier New" w:hAnsi="Courier New" w:cs="Courier New"/>
+          <w:sz w:val="18"/>
+          <w:szCs w:val="18"/>
+        </w:rPr>
+        <w:t xml:space="preserve"> </w:t>
       </w:r>
       <w:proofErr w:type="spellStart"/>
       <w:r>
@@ -1906,8 +2046,25 @@
     </w:p>
     <w:p/>
     <w:p>
-      <w:r>
-        <w:t>4. (9 marks) Suggest the most appropriate security measures for each situation described below.</w:t>
+      <w:pPr>
+        <w:pStyle w:val="Heading2"/>
+      </w:pPr>
+      <w:r>
+        <w:t>4.</w:t>
+      </w:r>
+      <w:r>
+        <w:t xml:space="preserve"> Question 4</w:t>
+      </w:r>
+    </w:p>
+    <w:p>
+      <w:pPr>
+        <w:pStyle w:val="Heading2"/>
+      </w:pPr>
+      <w:r>
+        <w:rPr>
+          <w:rStyle w:val="SubtitleChar"/>
+        </w:rPr>
+        <w:t>(9 marks) Suggest the most appropriate security measures for each situation described below.</w:t>
       </w:r>
     </w:p>
     <w:p>
@@ -1936,7 +2093,15 @@
         <w:t xml:space="preserve"> and reception. That means that the data must get through, without anyone being able to interrupt the process, alter the contents of the data, or be able to capture or read the data. This should be done by </w:t>
       </w:r>
       <w:r>
-        <w:t>protecting the means of communication between the two systems; if possible it should be an air-gapped direct physical connection, disconnected from any public</w:t>
+        <w:t xml:space="preserve">protecting the means of communication between the two systems; if </w:t>
+      </w:r>
+      <w:proofErr w:type="gramStart"/>
+      <w:r>
+        <w:t>possible</w:t>
+      </w:r>
+      <w:proofErr w:type="gramEnd"/>
+      <w:r>
+        <w:t xml:space="preserve"> it should be an air-gapped direct physical connection, disconnected from any public</w:t>
       </w:r>
       <w:r>
         <w:t xml:space="preserve"> </w:t>
@@ -1990,7 +2155,11 @@
         <w:t xml:space="preserve"> </w:t>
       </w:r>
       <w:r>
-        <w:t>employee's use of the centre is occasional, it does not wish to provide the employees with</w:t>
+        <w:t xml:space="preserve">employee's use of the centre is occasional, it does not wish to provide the employees </w:t>
+      </w:r>
+      <w:r>
+        <w:lastRenderedPageBreak/>
+        <w:t>with</w:t>
       </w:r>
       <w:r>
         <w:t xml:space="preserve"> </w:t>
@@ -2010,7 +2179,23 @@
         <w:t xml:space="preserve">If the </w:t>
       </w:r>
       <w:r>
-        <w:t>company doesn’t want to issue permanent keys to the employees, a password or biometric verification would be the best option.  A password could be enabled or disabled easily remotely, and not require that the employee have any physical key. Another option would be to use employee biometric information such as a finger print, voice confirmation, or retina scan to authenticate the user against</w:t>
+        <w:t xml:space="preserve">company doesn’t want to issue permanent keys to the employees, a password or biometric verification would be the best option.  A password could be enabled or disabled easily </w:t>
+      </w:r>
+      <w:proofErr w:type="gramStart"/>
+      <w:r>
+        <w:t>remotely, and</w:t>
+      </w:r>
+      <w:proofErr w:type="gramEnd"/>
+      <w:r>
+        <w:t xml:space="preserve"> not require that the employee have any physical key. Another option would be to use employee biometric information such as a </w:t>
+      </w:r>
+      <w:proofErr w:type="gramStart"/>
+      <w:r>
+        <w:t>finger print</w:t>
+      </w:r>
+      <w:proofErr w:type="gramEnd"/>
+      <w:r>
+        <w:t>, voice confirmation, or retina scan to authenticate the user against</w:t>
       </w:r>
       <w:r>
         <w:t xml:space="preserve"> scans obtained during employee onboarding.</w:t>
@@ -2054,7 +2239,6 @@
         <w:ind w:left="360"/>
       </w:pPr>
       <w:r>
-        <w:lastRenderedPageBreak/>
         <w:t>T</w:t>
       </w:r>
       <w:r>
@@ -2071,13 +2255,36 @@
       </w:r>
     </w:p>
     <w:p>
-      <w:r>
-        <w:t>5. (9 marks) Suggest an appropriate recovery technique a database administrator could use to resolve</w:t>
-      </w:r>
-      <w:r>
+      <w:pPr>
+        <w:pStyle w:val="Heading2"/>
+      </w:pPr>
+      <w:r>
+        <w:t xml:space="preserve">5. </w:t>
+      </w:r>
+      <w:r>
+        <w:t>Question 5</w:t>
+      </w:r>
+    </w:p>
+    <w:p>
+      <w:pPr>
+        <w:pStyle w:val="Heading2"/>
+      </w:pPr>
+      <w:r>
+        <w:rPr>
+          <w:rStyle w:val="SubtitleChar"/>
+        </w:rPr>
+        <w:t>(9 marks) Suggest an appropriate recovery technique a database administrator could use to resolve</w:t>
+      </w:r>
+      <w:r>
+        <w:rPr>
+          <w:rStyle w:val="SubtitleChar"/>
+        </w:rPr>
         <w:t xml:space="preserve"> </w:t>
       </w:r>
       <w:r>
+        <w:rPr>
+          <w:rStyle w:val="SubtitleChar"/>
+        </w:rPr>
         <w:t>each of the following situations.</w:t>
       </w:r>
     </w:p>
@@ -2108,13 +2315,37 @@
         <w:t xml:space="preserve">Depending on the database and </w:t>
       </w:r>
       <w:r>
-        <w:t>hardware configuration, some or all of the database and transaction can be restored.</w:t>
+        <w:t xml:space="preserve">hardware configuration, some or </w:t>
+      </w:r>
+      <w:proofErr w:type="gramStart"/>
+      <w:r>
+        <w:t>all of</w:t>
+      </w:r>
+      <w:proofErr w:type="gramEnd"/>
+      <w:r>
+        <w:t xml:space="preserve"> the database and transaction can be restored.</w:t>
       </w:r>
       <w:r>
         <w:t xml:space="preserve">  If the storage device that the database is installed on supports RAID mirroring, then </w:t>
       </w:r>
       <w:r>
-        <w:t>it should be possible to restore the database to the last successful write, and use the in memory transaction log to restore the last executed SQL command.</w:t>
+        <w:t xml:space="preserve">it should be possible to restore the database to the last successful </w:t>
+      </w:r>
+      <w:proofErr w:type="gramStart"/>
+      <w:r>
+        <w:t>write, and</w:t>
+      </w:r>
+      <w:proofErr w:type="gramEnd"/>
+      <w:r>
+        <w:t xml:space="preserve"> use the </w:t>
+      </w:r>
+      <w:proofErr w:type="gramStart"/>
+      <w:r>
+        <w:t>in memory</w:t>
+      </w:r>
+      <w:proofErr w:type="gramEnd"/>
+      <w:r>
+        <w:t xml:space="preserve"> transaction log to restore the last executed SQL command.</w:t>
       </w:r>
       <w:r>
         <w:t xml:space="preserve">  That would be an ideal situation and require a very specific set of conditions.  </w:t>
@@ -2123,8 +2354,13 @@
         <w:br/>
         <w:t xml:space="preserve">Database best practices </w:t>
       </w:r>
-      <w:r>
-        <w:t xml:space="preserve">calls for externally stored full backups to be run on a regular basis and partial backups on a very frequent basis. If the database is so negatively impacted by the drive failure, </w:t>
+      <w:proofErr w:type="gramStart"/>
+      <w:r>
+        <w:t>calls</w:t>
+      </w:r>
+      <w:proofErr w:type="gramEnd"/>
+      <w:r>
+        <w:t xml:space="preserve"> for externally stored full backups to be run on a regular basis and partial backups on a very frequent basis. If the database is so negatively impacted by the drive failure, </w:t>
       </w:r>
       <w:r>
         <w:t xml:space="preserve">then a recent backup can be restored from the external source.  </w:t>
@@ -2174,7 +2410,11 @@
         <w:t xml:space="preserve"> reconciled with other departments or </w:t>
       </w:r>
       <w:r>
-        <w:t>financial concerns. This means the best course of action would be to enter a financial correction for the current date in the amount of the error.  This would ensure that previously generated reports would remain valid.</w:t>
+        <w:t xml:space="preserve">financial concerns. This means the best course of action would be to enter a financial correction for the current date in the </w:t>
+      </w:r>
+      <w:r>
+        <w:lastRenderedPageBreak/>
+        <w:t>amount of the error.  This would ensure that previously generated reports would remain valid.</w:t>
       </w:r>
     </w:p>
     <w:p>
@@ -2219,7 +2459,15 @@
         <w:t xml:space="preserve">Unfortunately </w:t>
       </w:r>
       <w:r>
-        <w:t xml:space="preserve">recovering changes to a database after a backup was taken, and without any journaling, then its </w:t>
+        <w:t xml:space="preserve">recovering changes to a database after a backup was taken, and without any journaling, then </w:t>
+      </w:r>
+      <w:proofErr w:type="gramStart"/>
+      <w:r>
+        <w:t>its</w:t>
+      </w:r>
+      <w:proofErr w:type="gramEnd"/>
+      <w:r>
+        <w:t xml:space="preserve"> </w:t>
       </w:r>
       <w:r>
         <w:t>almost impossible</w:t>
@@ -2235,9 +2483,28 @@
       </w:r>
     </w:p>
     <w:p>
-      <w:r>
-        <w:lastRenderedPageBreak/>
-        <w:t>6. (12 marks) Answer the following questions (250 words max/question).</w:t>
+      <w:pPr>
+        <w:pStyle w:val="Heading2"/>
+      </w:pPr>
+      <w:r>
+        <w:t xml:space="preserve">6. </w:t>
+      </w:r>
+      <w:r>
+        <w:t>Question 6</w:t>
+      </w:r>
+    </w:p>
+    <w:p>
+      <w:pPr>
+        <w:pStyle w:val="Heading2"/>
+        <w:rPr>
+          <w:rStyle w:val="SubtitleChar"/>
+        </w:rPr>
+      </w:pPr>
+      <w:r>
+        <w:rPr>
+          <w:rStyle w:val="SubtitleChar"/>
+        </w:rPr>
+        <w:t>(12 marks) Answer the following questions (250 words max/question).</w:t>
       </w:r>
     </w:p>
     <w:p>
@@ -2336,7 +2603,15 @@
         <w:t xml:space="preserve">one involves keeping a copy of the data locally; data propagation.  Each </w:t>
       </w:r>
       <w:r>
-        <w:t xml:space="preserve">approach can be appropriate depending on the situation. If the external source data is always available and retrieval isn’t to resource expensive, then it would be the best situation, as there is only a single source of truth.  If however, retrieval of that data </w:t>
+        <w:t xml:space="preserve">approach can be appropriate depending on the situation. If the external source data is always available and retrieval isn’t to resource expensive, then it would be the best situation, as there is only a single source of truth.  </w:t>
+      </w:r>
+      <w:proofErr w:type="gramStart"/>
+      <w:r>
+        <w:t>If</w:t>
+      </w:r>
+      <w:proofErr w:type="gramEnd"/>
+      <w:r>
+        <w:t xml:space="preserve"> however, retrieval of that data </w:t>
       </w:r>
       <w:r>
         <w:t>is either slow, or not 100% available, then taking a copy would be a good option, in which case propagation should be used.</w:t>
@@ -2387,6 +2662,7 @@
           <w:lang w:eastAsia="en-CA"/>
           <w14:ligatures w14:val="none"/>
         </w:rPr>
+        <w:lastRenderedPageBreak/>
         <w:drawing>
           <wp:anchor distT="0" distB="0" distL="114300" distR="114300" simplePos="0" relativeHeight="251658240" behindDoc="0" locked="0" layoutInCell="1" allowOverlap="1" wp14:anchorId="7DBEBC3B" wp14:editId="78D3AE93">
             <wp:simplePos x="0" y="0"/>
@@ -2411,7 +2687,7 @@
                     <pic:cNvPicPr/>
                   </pic:nvPicPr>
                   <pic:blipFill>
-                    <a:blip r:embed="rId5" cstate="print">
+                    <a:blip r:embed="rId6" cstate="print">
                       <a:extLst>
                         <a:ext uri="{28A0092B-C50C-407E-A947-70E740481C1C}">
                           <a14:useLocalDpi xmlns:a14="http://schemas.microsoft.com/office/drawing/2010/main" val="0"/>
@@ -2520,8 +2796,26 @@
     </w:p>
     <w:p/>
     <w:p>
-      <w:r>
-        <w:t>7. (13 marks) Consider the following dimensions, dimension attributes, and dimension sizes for Farm</w:t>
+      <w:pPr>
+        <w:pStyle w:val="Heading2"/>
+      </w:pPr>
+      <w:r>
+        <w:lastRenderedPageBreak/>
+        <w:t xml:space="preserve">7. </w:t>
+      </w:r>
+      <w:r>
+        <w:t>Question 7</w:t>
+      </w:r>
+    </w:p>
+    <w:p>
+      <w:pPr>
+        <w:pStyle w:val="Heading2"/>
+      </w:pPr>
+      <w:r>
+        <w:rPr>
+          <w:rStyle w:val="SubtitleChar"/>
+        </w:rPr>
+        <w:t>(13 marks) Consider the following dimensions, dimension attributes, and dimension sizes for Farm</w:t>
       </w:r>
     </w:p>
     <w:p>
@@ -2537,10 +2831,12 @@
           <w:numId w:val="8"/>
         </w:numPr>
       </w:pPr>
+      <w:proofErr w:type="gramStart"/>
       <w:r>
         <w:t>Member(</w:t>
       </w:r>
       <w:proofErr w:type="spellStart"/>
+      <w:proofErr w:type="gramEnd"/>
       <w:r>
         <w:t>member_ID</w:t>
       </w:r>
@@ -2570,6 +2866,7 @@
         </w:numPr>
       </w:pPr>
       <w:proofErr w:type="spellStart"/>
+      <w:proofErr w:type="gramStart"/>
       <w:r>
         <w:t>InsuredItem</w:t>
       </w:r>
@@ -2578,6 +2875,7 @@
         <w:t>(</w:t>
       </w:r>
       <w:proofErr w:type="spellStart"/>
+      <w:proofErr w:type="gramEnd"/>
       <w:r>
         <w:t>Item_ID</w:t>
       </w:r>
@@ -2609,6 +2907,7 @@
         </w:numPr>
       </w:pPr>
       <w:proofErr w:type="spellStart"/>
+      <w:proofErr w:type="gramStart"/>
       <w:r>
         <w:t>CoopOffice</w:t>
       </w:r>
@@ -2617,6 +2916,7 @@
         <w:t>(</w:t>
       </w:r>
       <w:proofErr w:type="spellStart"/>
+      <w:proofErr w:type="gramEnd"/>
       <w:r>
         <w:t>Office_ID</w:t>
       </w:r>
@@ -2647,10 +2947,12 @@
           <w:numId w:val="8"/>
         </w:numPr>
       </w:pPr>
+      <w:proofErr w:type="gramStart"/>
       <w:r>
         <w:t>Policy(</w:t>
       </w:r>
       <w:proofErr w:type="spellStart"/>
+      <w:proofErr w:type="gramEnd"/>
       <w:r>
         <w:t>Policy_ID</w:t>
       </w:r>
@@ -2673,10 +2975,12 @@
           <w:numId w:val="8"/>
         </w:numPr>
       </w:pPr>
+      <w:proofErr w:type="gramStart"/>
       <w:r>
         <w:t>Period(</w:t>
       </w:r>
       <w:proofErr w:type="spellStart"/>
+      <w:proofErr w:type="gramEnd"/>
       <w:r>
         <w:t>Date_Key</w:t>
       </w:r>
@@ -2707,10 +3011,12 @@
           <w:numId w:val="8"/>
         </w:numPr>
       </w:pPr>
+      <w:proofErr w:type="gramStart"/>
       <w:r>
         <w:t>Claim(</w:t>
       </w:r>
       <w:proofErr w:type="spellStart"/>
+      <w:proofErr w:type="gramEnd"/>
       <w:r>
         <w:t>Claim_ID</w:t>
       </w:r>
@@ -2847,7 +3153,49 @@
       <w:proofErr w:type="spellEnd"/>
     </w:p>
     <w:p/>
-    <w:p/>
+    <w:p>
+      <w:r>
+        <w:rPr>
+          <w:noProof/>
+        </w:rPr>
+        <w:lastRenderedPageBreak/>
+        <w:drawing>
+          <wp:inline distT="0" distB="0" distL="0" distR="0" wp14:anchorId="72CF06B7" wp14:editId="5DFA0E7B">
+            <wp:extent cx="5943600" cy="3729355"/>
+            <wp:effectExtent l="0" t="0" r="0" b="4445"/>
+            <wp:docPr id="705575307" name="Picture 1"/>
+            <wp:cNvGraphicFramePr>
+              <a:graphicFrameLocks xmlns:a="http://schemas.openxmlformats.org/drawingml/2006/main" noChangeAspect="1"/>
+            </wp:cNvGraphicFramePr>
+            <a:graphic xmlns:a="http://schemas.openxmlformats.org/drawingml/2006/main">
+              <a:graphicData uri="http://schemas.openxmlformats.org/drawingml/2006/picture">
+                <pic:pic xmlns:pic="http://schemas.openxmlformats.org/drawingml/2006/picture">
+                  <pic:nvPicPr>
+                    <pic:cNvPr id="705575307" name=""/>
+                    <pic:cNvPicPr/>
+                  </pic:nvPicPr>
+                  <pic:blipFill>
+                    <a:blip r:embed="rId7"/>
+                    <a:stretch>
+                      <a:fillRect/>
+                    </a:stretch>
+                  </pic:blipFill>
+                  <pic:spPr>
+                    <a:xfrm>
+                      <a:off x="0" y="0"/>
+                      <a:ext cx="5943600" cy="3729355"/>
+                    </a:xfrm>
+                    <a:prstGeom prst="rect">
+                      <a:avLst/>
+                    </a:prstGeom>
+                  </pic:spPr>
+                </pic:pic>
+              </a:graphicData>
+            </a:graphic>
+          </wp:inline>
+        </w:drawing>
+      </w:r>
+    </w:p>
     <w:p/>
     <w:p>
       <w:r>
@@ -2864,6 +3212,91 @@
         <w:t>. (4 marks)</w:t>
       </w:r>
     </w:p>
+    <w:p>
+      <w:r>
+        <w:t>5% of policies per month</w:t>
+      </w:r>
+      <w:r>
+        <w:t xml:space="preserve"> make a claim = 1,000,000 * 0.05 = 50,000</w:t>
+      </w:r>
+      <w:r>
+        <w:br/>
+      </w:r>
+      <w:r>
+        <w:t>One office per policy = 5</w:t>
+      </w:r>
+      <w:r>
+        <w:t>0</w:t>
+      </w:r>
+      <w:r>
+        <w:t>,000 x 1 = 5</w:t>
+      </w:r>
+      <w:r>
+        <w:t>0</w:t>
+      </w:r>
+      <w:r>
+        <w:t>,000</w:t>
+      </w:r>
+      <w:r>
+        <w:t xml:space="preserve"> rows</w:t>
+      </w:r>
+      <w:r>
+        <w:br/>
+      </w:r>
+      <w:r>
+        <w:t>Ten items per policy = 5</w:t>
+      </w:r>
+      <w:r>
+        <w:t>0</w:t>
+      </w:r>
+      <w:r>
+        <w:t>,000 x 10 =</w:t>
+      </w:r>
+      <w:r>
+        <w:t xml:space="preserve"> 500</w:t>
+      </w:r>
+      <w:r>
+        <w:t>,000 rows</w:t>
+      </w:r>
+      <w:r>
+        <w:br/>
+      </w:r>
+      <w:r>
+        <w:t xml:space="preserve">Two members per policy = </w:t>
+      </w:r>
+      <w:r>
+        <w:t xml:space="preserve">500,000 </w:t>
+      </w:r>
+      <w:r>
+        <w:t xml:space="preserve">x 2 = </w:t>
+      </w:r>
+      <w:r>
+        <w:t xml:space="preserve">1,000,000 </w:t>
+      </w:r>
+      <w:r>
+        <w:t>rows</w:t>
+      </w:r>
+      <w:r>
+        <w:t xml:space="preserve"> per month</w:t>
+      </w:r>
+      <w:r>
+        <w:br/>
+      </w:r>
+      <w:r>
+        <w:t xml:space="preserve">5 years of months = 1,000,000 x 12 x 5 = 60,000,000 </w:t>
+      </w:r>
+      <w:r>
+        <w:br/>
+      </w:r>
+    </w:p>
+    <w:p>
+      <w:r>
+        <w:t>Total estimate rows in fact table = 20,100,000 rows.</w:t>
+      </w:r>
+      <w:r>
+        <w:br/>
+      </w:r>
+    </w:p>
     <w:p/>
     <w:p>
       <w:r>
@@ -2896,10 +3329,80 @@
         <w:t>(4 marks)</w:t>
       </w:r>
     </w:p>
+    <w:p>
+      <w:r>
+        <w:t xml:space="preserve">9 fields x 5 bytes = 45 bytes per row. </w:t>
+      </w:r>
+      <w:r>
+        <w:br/>
+        <w:t xml:space="preserve">45 bytes x 20,100,000 rows = </w:t>
+      </w:r>
+      <w:proofErr w:type="gramStart"/>
+      <w:r>
+        <w:t>904</w:t>
+      </w:r>
+      <w:r>
+        <w:t>,</w:t>
+      </w:r>
+      <w:r>
+        <w:t>500</w:t>
+      </w:r>
+      <w:r>
+        <w:t>,</w:t>
+      </w:r>
+      <w:r>
+        <w:t>000</w:t>
+      </w:r>
+      <w:r>
+        <w:t xml:space="preserve">  total</w:t>
+      </w:r>
+      <w:proofErr w:type="gramEnd"/>
+      <w:r>
+        <w:t xml:space="preserve"> bytes = </w:t>
+      </w:r>
+      <w:r>
+        <w:t>904.50 megabytes.</w:t>
+      </w:r>
+    </w:p>
     <w:p/>
     <w:p>
-      <w:r>
-        <w:t xml:space="preserve">8. (12 marks) For each of the following applications, state </w:t>
+      <w:pPr>
+        <w:rPr>
+          <w:rFonts w:eastAsiaTheme="majorEastAsia" w:cstheme="majorBidi"/>
+          <w:color w:val="595959" w:themeColor="text1" w:themeTint="A6"/>
+          <w:spacing w:val="15"/>
+          <w:sz w:val="28"/>
+          <w:szCs w:val="28"/>
+        </w:rPr>
+      </w:pPr>
+      <w:r>
+        <w:br w:type="page"/>
+      </w:r>
+    </w:p>
+    <w:p>
+      <w:pPr>
+        <w:pStyle w:val="Subtitle"/>
+        <w:rPr>
+          <w:rStyle w:val="Heading2Char"/>
+        </w:rPr>
+      </w:pPr>
+      <w:r>
+        <w:lastRenderedPageBreak/>
+        <w:t xml:space="preserve">8. </w:t>
+      </w:r>
+      <w:r>
+        <w:rPr>
+          <w:rStyle w:val="Heading2Char"/>
+        </w:rPr>
+        <w:t>Question 8</w:t>
+      </w:r>
+    </w:p>
+    <w:p>
+      <w:pPr>
+        <w:pStyle w:val="Subtitle"/>
+      </w:pPr>
+      <w:r>
+        <w:t xml:space="preserve">(12 marks) For each of the following applications, state </w:t>
       </w:r>
       <w:r>
         <w:rPr>
@@ -2913,6 +3416,9 @@
       </w:r>
     </w:p>
     <w:p>
+      <w:pPr>
+        <w:pStyle w:val="Subtitle"/>
+      </w:pPr>
       <w:r>
         <w:t>needs of the situation. Justify your answer.</w:t>
       </w:r>
@@ -2920,158 +3426,508 @@
     <w:p/>
     <w:p>
       <w:r>
-        <w:t xml:space="preserve">A database that needs to support a relatively </w:t>
+        <w:t xml:space="preserve">The types of NoSQL </w:t>
+      </w:r>
+      <w:r>
+        <w:t xml:space="preserve">DBMS </w:t>
+      </w:r>
+      <w:proofErr w:type="gramStart"/>
+      <w:r>
+        <w:t>are:</w:t>
+      </w:r>
+      <w:proofErr w:type="gramEnd"/>
+      <w:r>
+        <w:t xml:space="preserve"> Key / Value pair, document stores, wide-column stores, and graph databases.</w:t>
+      </w:r>
+      <w:r>
+        <w:br/>
       </w:r>
       <w:r>
         <w:rPr>
           <w:b/>
           <w:bCs/>
         </w:rPr>
-        <w:t>complex hierarchical internal</w:t>
-      </w:r>
-      <w:r>
-        <w:t xml:space="preserve"> records structure that</w:t>
-      </w:r>
-    </w:p>
-    <w:p>
-      <w:r>
-        <w:t>may vary for each record</w:t>
-      </w:r>
-    </w:p>
-    <w:p/>
-    <w:p>
-      <w:pPr>
+        <w:t>Key Value</w:t>
+      </w:r>
+      <w:r>
+        <w:t>: simple key and simple value. Fastest</w:t>
+      </w:r>
+      <w:r>
+        <w:t xml:space="preserve"> and easiest type, a single value maps to a single key. Great for fast retrieval, caching, session storage etc.</w:t>
+      </w:r>
+      <w:r>
+        <w:br/>
+      </w:r>
+      <w:r>
         <w:rPr>
           <w:b/>
           <w:bCs/>
         </w:rPr>
-      </w:pPr>
-      <w:r>
-        <w:t xml:space="preserve">A database where the data is particularly well suited to be organized as a </w:t>
+        <w:t>Document Stores</w:t>
+      </w:r>
+      <w:r>
+        <w:t xml:space="preserve">: </w:t>
+      </w:r>
+      <w:proofErr w:type="gramStart"/>
+      <w:r>
+        <w:t>Similar to</w:t>
+      </w:r>
+      <w:proofErr w:type="gramEnd"/>
+      <w:r>
+        <w:t xml:space="preserve"> Key </w:t>
+      </w:r>
+      <w:proofErr w:type="gramStart"/>
+      <w:r>
+        <w:t>Value, but</w:t>
+      </w:r>
+      <w:proofErr w:type="gramEnd"/>
+      <w:r>
+        <w:t xml:space="preserve"> stores a structured document (usually JSON) instead of a simple value.</w:t>
+      </w:r>
+      <w:r>
+        <w:t xml:space="preserve">  Great for hierarchical data, or a</w:t>
+      </w:r>
+      <w:r>
+        <w:t xml:space="preserve"> flexible schema that will allow for evolution.</w:t>
+      </w:r>
+      <w:r>
+        <w:br/>
       </w:r>
       <w:r>
         <w:rPr>
           <w:b/>
           <w:bCs/>
         </w:rPr>
-        <w:t>network of associations</w:t>
-      </w:r>
-    </w:p>
-    <w:p>
-      <w:pPr>
+        <w:t>Column Wide</w:t>
+      </w:r>
+      <w:r>
+        <w:t>: Data is organized</w:t>
+      </w:r>
+      <w:r>
+        <w:t xml:space="preserve"> into rows with large numbers of columns, grouped together.  Good for large throughput or analytical data involving dates or </w:t>
+      </w:r>
+      <w:r>
+        <w:t>changes over time.</w:t>
+      </w:r>
+      <w:r>
+        <w:t xml:space="preserve"> </w:t>
+      </w:r>
+      <w:r>
+        <w:br/>
+      </w:r>
+      <w:r>
         <w:rPr>
           <w:b/>
           <w:bCs/>
         </w:rPr>
-      </w:pPr>
+        <w:t>Graph data:</w:t>
+      </w:r>
+      <w:r>
+        <w:t xml:space="preserve"> </w:t>
+      </w:r>
+      <w:r>
+        <w:t>Data is organized by nodes, and edges. Edges describe the relationship between nodes, allowing for quick an easy retrieval of related nodes, or even relationships. Excellent for social networking.</w:t>
+      </w:r>
+    </w:p>
+    <w:p/>
+    <w:p>
       <w:r>
         <w:rPr>
           <w:b/>
           <w:bCs/>
         </w:rPr>
-        <w:t>between the data items</w:t>
-      </w:r>
-    </w:p>
-    <w:p/>
-    <w:p>
-      <w:pPr>
+        <w:t>A database that needs to support a relatively complex hierarchical internal records structure that</w:t>
+      </w:r>
+      <w:r>
         <w:rPr>
           <w:b/>
           <w:bCs/>
         </w:rPr>
-      </w:pPr>
-      <w:r>
-        <w:t xml:space="preserve">A database for which the DMS needs to provide </w:t>
+        <w:t xml:space="preserve"> </w:t>
       </w:r>
       <w:r>
         <w:rPr>
           <w:b/>
           <w:bCs/>
         </w:rPr>
-        <w:t>quick access to each of the records by key</w:t>
-      </w:r>
-    </w:p>
-    <w:p>
-      <w:r>
+        <w:t>may vary for each record</w:t>
+      </w:r>
+    </w:p>
+    <w:p>
+      <w:r>
+        <w:t xml:space="preserve">A document store NoSQL DBMS would be the best selection for this </w:t>
+      </w:r>
+      <w:r>
+        <w:t>because it allows storage of complex documents, such as JSON objects</w:t>
+      </w:r>
+      <w:r>
+        <w:t xml:space="preserve"> but also supports hi</w:t>
+      </w:r>
+      <w:r>
+        <w:t>erarchical</w:t>
+      </w:r>
+      <w:r>
+        <w:t xml:space="preserve"> structures.</w:t>
+      </w:r>
+    </w:p>
+    <w:p/>
+    <w:p>
+      <w:pPr>
         <w:rPr>
           <w:b/>
           <w:bCs/>
         </w:rPr>
-        <w:t>value</w:t>
-      </w:r>
-      <w:r>
-        <w:t xml:space="preserve">, but in addition to that, must </w:t>
-      </w:r>
+      </w:pPr>
       <w:r>
         <w:rPr>
           <w:b/>
           <w:bCs/>
         </w:rPr>
-        <w:t>also allow easy access to the components</w:t>
-      </w:r>
-      <w:r>
-        <w:t xml:space="preserve"> of each record</w:t>
-      </w:r>
-    </w:p>
-    <w:p/>
-    <w:p/>
-    <w:p>
-      <w:r>
-        <w:t xml:space="preserve">9. (12 marks) For each of the following data analytics situations, state </w:t>
+        <w:t>A database where the data is particularly well suited to be organized as a network of associations</w:t>
       </w:r>
       <w:r>
         <w:rPr>
           <w:b/>
           <w:bCs/>
         </w:rPr>
-        <w:t>which type of analytics</w:t>
-      </w:r>
-      <w:r>
-        <w:t xml:space="preserve"> would</w:t>
-      </w:r>
-      <w:r>
         <w:t xml:space="preserve"> </w:t>
       </w:r>
       <w:r>
+        <w:rPr>
+          <w:b/>
+          <w:bCs/>
+        </w:rPr>
+        <w:t>between the data items</w:t>
+      </w:r>
+    </w:p>
+    <w:p>
+      <w:r>
+        <w:t>Grap</w:t>
+      </w:r>
+      <w:r>
+        <w:t>h data would be best suited to managed data organized as network of associations. This is because graph data DMBS uses nodes and edges to manage the differences between entities and the relationships between them.</w:t>
+      </w:r>
+    </w:p>
+    <w:p/>
+    <w:p>
+      <w:pPr>
+        <w:rPr>
+          <w:b/>
+          <w:bCs/>
+        </w:rPr>
+      </w:pPr>
+      <w:r>
+        <w:t xml:space="preserve">A database for which the DMS needs to provide </w:t>
+      </w:r>
+      <w:r>
+        <w:rPr>
+          <w:b/>
+          <w:bCs/>
+        </w:rPr>
+        <w:t>quick access to each of the records by key</w:t>
+      </w:r>
+    </w:p>
+    <w:p>
+      <w:r>
+        <w:rPr>
+          <w:b/>
+          <w:bCs/>
+        </w:rPr>
+        <w:t>value</w:t>
+      </w:r>
+      <w:r>
+        <w:t xml:space="preserve">, but in addition to that, must </w:t>
+      </w:r>
+      <w:r>
+        <w:rPr>
+          <w:b/>
+          <w:bCs/>
+        </w:rPr>
+        <w:t>also allow easy access to the components</w:t>
+      </w:r>
+      <w:r>
+        <w:t xml:space="preserve"> of each record</w:t>
+      </w:r>
+    </w:p>
+    <w:p>
+      <w:r>
+        <w:t>Column wide would be best for querying data with easy access to components of each record. This is because the components of the record are stored in organized and grouped sections within the row.  Retrieval of the row is easy via key, and grouping allows for components to be easily accessible.</w:t>
+      </w:r>
+    </w:p>
+    <w:p/>
+    <w:p>
+      <w:pPr>
+        <w:pStyle w:val="Heading2"/>
+      </w:pPr>
+      <w:r>
+        <w:lastRenderedPageBreak/>
+        <w:t xml:space="preserve">9. </w:t>
+      </w:r>
+      <w:r>
+        <w:t>Question 9</w:t>
+      </w:r>
+    </w:p>
+    <w:p>
+      <w:pPr>
+        <w:pStyle w:val="Heading2"/>
+      </w:pPr>
+      <w:r>
+        <w:rPr>
+          <w:rStyle w:val="SubtitleChar"/>
+        </w:rPr>
+        <w:t>(12 marks) For each of the following data analytics situations, state which type of analytics would</w:t>
+      </w:r>
+      <w:r>
+        <w:rPr>
+          <w:rStyle w:val="SubtitleChar"/>
+        </w:rPr>
+        <w:t xml:space="preserve"> </w:t>
+      </w:r>
+      <w:r>
+        <w:rPr>
+          <w:rStyle w:val="SubtitleChar"/>
+        </w:rPr>
         <w:t>address the needs of the organization. Justify your answer.</w:t>
       </w:r>
     </w:p>
     <w:p/>
     <w:p>
       <w:r>
+        <w:t xml:space="preserve">The three types of analytics are </w:t>
+      </w:r>
+      <w:r>
+        <w:t>descriptive</w:t>
+      </w:r>
+      <w:r>
+        <w:t xml:space="preserve"> analytics</w:t>
+      </w:r>
+      <w:r>
+        <w:t xml:space="preserve">, </w:t>
+      </w:r>
+      <w:r>
+        <w:t xml:space="preserve">predictive </w:t>
+      </w:r>
+      <w:r>
+        <w:t xml:space="preserve">analytics </w:t>
+      </w:r>
+      <w:r>
+        <w:t xml:space="preserve">and </w:t>
+      </w:r>
+      <w:r>
+        <w:t>prescriptive</w:t>
+      </w:r>
+      <w:r>
+        <w:t xml:space="preserve"> analytics</w:t>
+      </w:r>
+      <w:r>
+        <w:t>.</w:t>
+      </w:r>
+    </w:p>
+    <w:p>
+      <w:r>
+        <w:t xml:space="preserve"> </w:t>
+      </w:r>
+    </w:p>
+    <w:p>
+      <w:r>
+        <w:rPr>
+          <w:b/>
+          <w:bCs/>
+        </w:rPr>
         <w:t>National Bank of Canada, which is a midsize bank in Canada, would like to provide decision</w:t>
       </w:r>
-    </w:p>
-    <w:p>
-      <w:r>
+      <w:r>
+        <w:rPr>
+          <w:b/>
+          <w:bCs/>
+        </w:rPr>
+        <w:t xml:space="preserve"> </w:t>
+      </w:r>
+      <w:r>
+        <w:rPr>
+          <w:b/>
+          <w:bCs/>
+        </w:rPr>
         <w:t>support analytics for its agents in the lending department.</w:t>
       </w:r>
+      <w:r>
+        <w:br/>
+      </w:r>
+      <w:r>
+        <w:br/>
+      </w:r>
+      <w:r>
+        <w:t xml:space="preserve">Since the National Bank wants to use analytics to aid in decision making, then it should use prescriptive analytics. </w:t>
+      </w:r>
+      <w:r>
+        <w:t xml:space="preserve">  Prescriptive analytics </w:t>
+      </w:r>
+      <w:r>
+        <w:t xml:space="preserve">uses </w:t>
+      </w:r>
+      <w:r>
+        <w:t xml:space="preserve">predictive analysis of descriptive trends to make the most correct, </w:t>
+      </w:r>
+      <w:r>
+        <w:t>best-informed</w:t>
+      </w:r>
+      <w:r>
+        <w:t xml:space="preserve"> decisions.</w:t>
+      </w:r>
+    </w:p>
+    <w:p>
+      <w:r>
+        <w:t xml:space="preserve">An example of prescriptive analysis performed could be the analysis of a </w:t>
+      </w:r>
+      <w:r>
+        <w:t>client’s</w:t>
+      </w:r>
+      <w:r>
+        <w:t xml:space="preserve"> credit, employment and </w:t>
+      </w:r>
+      <w:r>
+        <w:t xml:space="preserve">outstanding debts and assets.  This could indicate the risk associated with </w:t>
+      </w:r>
+      <w:proofErr w:type="spellStart"/>
+      <w:r>
+        <w:t>thie</w:t>
+      </w:r>
+      <w:proofErr w:type="spellEnd"/>
+      <w:r>
+        <w:t xml:space="preserve"> client taking additional debt, and</w:t>
+      </w:r>
+      <w:r>
+        <w:t xml:space="preserve"> to prescribe ideal interest rate and terms.</w:t>
+      </w:r>
     </w:p>
     <w:p/>
     <w:p>
-      <w:r>
+      <w:pPr>
+        <w:rPr>
+          <w:b/>
+          <w:bCs/>
+        </w:rPr>
+      </w:pPr>
+      <w:r>
+        <w:rPr>
+          <w:b/>
+          <w:bCs/>
+        </w:rPr>
         <w:t>President’s Choice, which is a large retail chain in North America, wants to understand what</w:t>
       </w:r>
-    </w:p>
-    <w:p>
-      <w:r>
+      <w:r>
+        <w:rPr>
+          <w:b/>
+          <w:bCs/>
+        </w:rPr>
+        <w:t xml:space="preserve"> </w:t>
+      </w:r>
+      <w:r>
+        <w:rPr>
+          <w:b/>
+          <w:bCs/>
+        </w:rPr>
         <w:t>factors contributed to the overall sales decline it experienced in a specific month of last year.</w:t>
       </w:r>
     </w:p>
+    <w:p>
+      <w:r>
+        <w:t>Predictive analytics uses historical data to identify patterns and relationships that help explain outcomes. Since President’s Choice wants to understand what factors contributed to the sales decline, it should use predictive analytics. Predictive models can analyze past sales data, customer behavior, promotions, pricing changes, and external factors to determine which variables were most strongly associated with the decline in that specific month.</w:t>
+      </w:r>
+    </w:p>
     <w:p/>
     <w:p>
-      <w:r>
-        <w:t>Ubisoft, which is a video game company, wants to provide all its employees with an up-to-date</w:t>
-      </w:r>
-    </w:p>
-    <w:p>
-      <w:r>
+      <w:pPr>
+        <w:rPr>
+          <w:b/>
+          <w:bCs/>
+        </w:rPr>
+      </w:pPr>
+      <w:r>
+        <w:rPr>
+          <w:b/>
+          <w:bCs/>
+        </w:rPr>
+        <w:t xml:space="preserve">Ubisoft, which is a video game company, wants to provide all its employees with an </w:t>
+      </w:r>
+      <w:proofErr w:type="gramStart"/>
+      <w:r>
+        <w:rPr>
+          <w:b/>
+          <w:bCs/>
+        </w:rPr>
+        <w:t>up-to-date</w:t>
+      </w:r>
+      <w:proofErr w:type="gramEnd"/>
+    </w:p>
+    <w:p>
+      <w:pPr>
+        <w:rPr>
+          <w:b/>
+          <w:bCs/>
+        </w:rPr>
+      </w:pPr>
+      <w:r>
+        <w:rPr>
+          <w:b/>
+          <w:bCs/>
+        </w:rPr>
         <w:t>graphical representation of the number of downloads of its game products and in-app revenue</w:t>
       </w:r>
     </w:p>
     <w:p>
-      <w:r>
+      <w:pPr>
+        <w:rPr>
+          <w:b/>
+          <w:bCs/>
+        </w:rPr>
+      </w:pPr>
+      <w:r>
+        <w:rPr>
+          <w:b/>
+          <w:bCs/>
+        </w:rPr>
         <w:t>associated with them.</w:t>
+      </w:r>
+    </w:p>
+    <w:p>
+      <w:r>
+        <w:t>Descriptive analysis</w:t>
+      </w:r>
+      <w:r>
+        <w:t xml:space="preserve"> is the process of extracting data objectively</w:t>
+      </w:r>
+      <w:r>
+        <w:t xml:space="preserve"> to describe the past status of </w:t>
+      </w:r>
+      <w:r>
+        <w:t xml:space="preserve">a system. In this case, Ubisoft wants to </w:t>
+      </w:r>
+      <w:r>
+        <w:t xml:space="preserve">gather the real time data of number of downloads of game products and associated revenue. Since this process is extractions and </w:t>
+      </w:r>
+      <w:r>
+        <w:t xml:space="preserve">objective </w:t>
+      </w:r>
+      <w:r>
+        <w:t xml:space="preserve">representation of </w:t>
+      </w:r>
+      <w:proofErr w:type="gramStart"/>
+      <w:r>
+        <w:t xml:space="preserve">data, </w:t>
+      </w:r>
+      <w:r>
+        <w:t>and</w:t>
+      </w:r>
+      <w:proofErr w:type="gramEnd"/>
+      <w:r>
+        <w:t xml:space="preserve"> does not involve </w:t>
+      </w:r>
+      <w:r>
+        <w:t xml:space="preserve">extracting assumptions or predictions out of this data, </w:t>
+      </w:r>
+      <w:r>
+        <w:t xml:space="preserve">it would be considered descriptive analysis. </w:t>
       </w:r>
     </w:p>
     <w:sectPr>
@@ -4535,7 +5391,6 @@
     <w:next w:val="Normal"/>
     <w:link w:val="Heading2Char"/>
     <w:uiPriority w:val="9"/>
-    <w:semiHidden/>
     <w:unhideWhenUsed/>
     <w:qFormat/>
     <w:rsid w:val="00E4447D"/>
@@ -4752,7 +5607,6 @@
     <w:basedOn w:val="DefaultParagraphFont"/>
     <w:link w:val="Heading2"/>
     <w:uiPriority w:val="9"/>
-    <w:semiHidden/>
     <w:rsid w:val="00E4447D"/>
     <w:rPr>
       <w:rFonts w:asciiTheme="majorHAnsi" w:eastAsiaTheme="majorEastAsia" w:hAnsiTheme="majorHAnsi" w:cstheme="majorBidi"/>
@@ -5022,6 +5876,194 @@
       <w:smallCaps/>
       <w:color w:val="0F4761" w:themeColor="accent1" w:themeShade="BF"/>
       <w:spacing w:val="5"/>
+    </w:rPr>
+  </w:style>
+  <w:style w:type="paragraph" w:styleId="TOCHeading">
+    <w:name w:val="TOC Heading"/>
+    <w:basedOn w:val="Heading1"/>
+    <w:next w:val="Normal"/>
+    <w:uiPriority w:val="39"/>
+    <w:unhideWhenUsed/>
+    <w:qFormat/>
+    <w:rsid w:val="00C67039"/>
+    <w:pPr>
+      <w:spacing w:before="240" w:after="0"/>
+      <w:outlineLvl w:val="9"/>
+    </w:pPr>
+    <w:rPr>
+      <w:kern w:val="0"/>
+      <w:sz w:val="32"/>
+      <w:szCs w:val="32"/>
+      <w:lang w:val="en-US"/>
+      <w14:ligatures w14:val="none"/>
+    </w:rPr>
+  </w:style>
+  <w:style w:type="paragraph" w:styleId="TOC2">
+    <w:name w:val="toc 2"/>
+    <w:basedOn w:val="Normal"/>
+    <w:next w:val="Normal"/>
+    <w:autoRedefine/>
+    <w:uiPriority w:val="39"/>
+    <w:unhideWhenUsed/>
+    <w:rsid w:val="00A678B0"/>
+    <w:pPr>
+      <w:spacing w:before="240" w:after="0"/>
+    </w:pPr>
+    <w:rPr>
+      <w:b/>
+      <w:bCs/>
+      <w:sz w:val="20"/>
+      <w:szCs w:val="20"/>
+    </w:rPr>
+  </w:style>
+  <w:style w:type="character" w:styleId="Hyperlink">
+    <w:name w:val="Hyperlink"/>
+    <w:basedOn w:val="DefaultParagraphFont"/>
+    <w:uiPriority w:val="99"/>
+    <w:unhideWhenUsed/>
+    <w:rsid w:val="00A678B0"/>
+    <w:rPr>
+      <w:color w:val="467886" w:themeColor="hyperlink"/>
+      <w:u w:val="single"/>
+    </w:rPr>
+  </w:style>
+  <w:style w:type="paragraph" w:styleId="TOC1">
+    <w:name w:val="toc 1"/>
+    <w:basedOn w:val="Normal"/>
+    <w:next w:val="Normal"/>
+    <w:autoRedefine/>
+    <w:uiPriority w:val="39"/>
+    <w:unhideWhenUsed/>
+    <w:rsid w:val="00A11FDC"/>
+    <w:pPr>
+      <w:spacing w:before="360" w:after="0"/>
+    </w:pPr>
+    <w:rPr>
+      <w:rFonts w:asciiTheme="majorHAnsi" w:hAnsiTheme="majorHAnsi"/>
+      <w:b/>
+      <w:bCs/>
+      <w:caps/>
+      <w:sz w:val="24"/>
+      <w:szCs w:val="24"/>
+    </w:rPr>
+  </w:style>
+  <w:style w:type="paragraph" w:styleId="TOC3">
+    <w:name w:val="toc 3"/>
+    <w:basedOn w:val="Normal"/>
+    <w:next w:val="Normal"/>
+    <w:autoRedefine/>
+    <w:uiPriority w:val="39"/>
+    <w:unhideWhenUsed/>
+    <w:rsid w:val="00A11FDC"/>
+    <w:pPr>
+      <w:spacing w:after="0"/>
+      <w:ind w:left="220"/>
+    </w:pPr>
+    <w:rPr>
+      <w:sz w:val="20"/>
+      <w:szCs w:val="20"/>
+    </w:rPr>
+  </w:style>
+  <w:style w:type="paragraph" w:styleId="TOC4">
+    <w:name w:val="toc 4"/>
+    <w:basedOn w:val="Normal"/>
+    <w:next w:val="Normal"/>
+    <w:autoRedefine/>
+    <w:uiPriority w:val="39"/>
+    <w:unhideWhenUsed/>
+    <w:rsid w:val="00A11FDC"/>
+    <w:pPr>
+      <w:spacing w:after="0"/>
+      <w:ind w:left="440"/>
+    </w:pPr>
+    <w:rPr>
+      <w:sz w:val="20"/>
+      <w:szCs w:val="20"/>
+    </w:rPr>
+  </w:style>
+  <w:style w:type="paragraph" w:styleId="TOC5">
+    <w:name w:val="toc 5"/>
+    <w:basedOn w:val="Normal"/>
+    <w:next w:val="Normal"/>
+    <w:autoRedefine/>
+    <w:uiPriority w:val="39"/>
+    <w:unhideWhenUsed/>
+    <w:rsid w:val="00A11FDC"/>
+    <w:pPr>
+      <w:spacing w:after="0"/>
+      <w:ind w:left="660"/>
+    </w:pPr>
+    <w:rPr>
+      <w:sz w:val="20"/>
+      <w:szCs w:val="20"/>
+    </w:rPr>
+  </w:style>
+  <w:style w:type="paragraph" w:styleId="TOC6">
+    <w:name w:val="toc 6"/>
+    <w:basedOn w:val="Normal"/>
+    <w:next w:val="Normal"/>
+    <w:autoRedefine/>
+    <w:uiPriority w:val="39"/>
+    <w:unhideWhenUsed/>
+    <w:rsid w:val="00A11FDC"/>
+    <w:pPr>
+      <w:spacing w:after="0"/>
+      <w:ind w:left="880"/>
+    </w:pPr>
+    <w:rPr>
+      <w:sz w:val="20"/>
+      <w:szCs w:val="20"/>
+    </w:rPr>
+  </w:style>
+  <w:style w:type="paragraph" w:styleId="TOC7">
+    <w:name w:val="toc 7"/>
+    <w:basedOn w:val="Normal"/>
+    <w:next w:val="Normal"/>
+    <w:autoRedefine/>
+    <w:uiPriority w:val="39"/>
+    <w:unhideWhenUsed/>
+    <w:rsid w:val="00A11FDC"/>
+    <w:pPr>
+      <w:spacing w:after="0"/>
+      <w:ind w:left="1100"/>
+    </w:pPr>
+    <w:rPr>
+      <w:sz w:val="20"/>
+      <w:szCs w:val="20"/>
+    </w:rPr>
+  </w:style>
+  <w:style w:type="paragraph" w:styleId="TOC8">
+    <w:name w:val="toc 8"/>
+    <w:basedOn w:val="Normal"/>
+    <w:next w:val="Normal"/>
+    <w:autoRedefine/>
+    <w:uiPriority w:val="39"/>
+    <w:unhideWhenUsed/>
+    <w:rsid w:val="00A11FDC"/>
+    <w:pPr>
+      <w:spacing w:after="0"/>
+      <w:ind w:left="1320"/>
+    </w:pPr>
+    <w:rPr>
+      <w:sz w:val="20"/>
+      <w:szCs w:val="20"/>
+    </w:rPr>
+  </w:style>
+  <w:style w:type="paragraph" w:styleId="TOC9">
+    <w:name w:val="toc 9"/>
+    <w:basedOn w:val="Normal"/>
+    <w:next w:val="Normal"/>
+    <w:autoRedefine/>
+    <w:uiPriority w:val="39"/>
+    <w:unhideWhenUsed/>
+    <w:rsid w:val="00A11FDC"/>
+    <w:pPr>
+      <w:spacing w:after="0"/>
+      <w:ind w:left="1540"/>
+    </w:pPr>
+    <w:rPr>
+      <w:sz w:val="20"/>
+      <w:szCs w:val="20"/>
     </w:rPr>
   </w:style>
 </w:styles>
@@ -5320,4 +6362,16 @@
     </a:ext>
   </a:extLst>
 </a:theme>
+</file>
+
+<file path=customXml/item1.xml><?xml version="1.0" encoding="utf-8"?>
+<b:Sources xmlns:b="http://schemas.openxmlformats.org/officeDocument/2006/bibliography" xmlns="http://schemas.openxmlformats.org/officeDocument/2006/bibliography" SelectedStyle="\APASixthEditionOfficeOnline.xsl" StyleName="APA" Version="6"/>
+</file>
+
+<file path=customXml/itemProps1.xml><?xml version="1.0" encoding="utf-8"?>
+<ds:datastoreItem xmlns:ds="http://schemas.openxmlformats.org/officeDocument/2006/customXml" ds:itemID="{A6C7761C-36D5-4BCA-BD68-2C6CE4C22644}">
+  <ds:schemaRefs>
+    <ds:schemaRef ds:uri="http://schemas.openxmlformats.org/officeDocument/2006/bibliography"/>
+  </ds:schemaRefs>
+</ds:datastoreItem>
 </file>
</xml_diff>